<commit_message>
Update Gant Chart; Update Network Diagram; Update Calendar; Update Task Info WBS-17
</commit_message>
<xml_diff>
--- a/Documentation/Analysis/Task Informations/In Progress/Abolfazl/Task Info WBS-17 - W.docx
+++ b/Documentation/Analysis/Task Informations/In Progress/Abolfazl/Task Info WBS-17 - W.docx
@@ -414,7 +414,7 @@
                   <w14:bevel/>
                 </w14:textOutline>
               </w:rPr>
-              <w:t>First version of project network diagram</w:t>
+              <w:t xml:space="preserve">First version of project </w:t>
             </w:r>
             <w:r>
               <w:rPr>
@@ -430,9 +430,8 @@
                   <w14:bevel/>
                 </w14:textOutline>
               </w:rPr>
-              <w:t xml:space="preserve"> and </w:t>
+              <w:t>N</w:t>
             </w:r>
-            <w:proofErr w:type="spellStart"/>
             <w:r>
               <w:rPr>
                 <w:rFonts w:ascii="Arial" w:hAnsi="Arial" w:cs="Arial Unicode MS"/>
@@ -447,9 +446,8 @@
                   <w14:bevel/>
                 </w14:textOutline>
               </w:rPr>
-              <w:t>gant</w:t>
+              <w:t>etwork diagram</w:t>
             </w:r>
-            <w:proofErr w:type="spellEnd"/>
             <w:r>
               <w:rPr>
                 <w:rFonts w:ascii="Arial" w:hAnsi="Arial" w:cs="Arial Unicode MS"/>
@@ -464,7 +462,39 @@
                   <w14:bevel/>
                 </w14:textOutline>
               </w:rPr>
-              <w:t xml:space="preserve"> chart</w:t>
+              <w:t xml:space="preserve"> and </w:t>
+            </w:r>
+            <w:r>
+              <w:rPr>
+                <w:rFonts w:ascii="Arial" w:hAnsi="Arial" w:cs="Arial Unicode MS"/>
+                <w:color w:val="000000"/>
+                <w:kern w:val="2"/>
+                <w:sz w:val="28"/>
+                <w:szCs w:val="28"/>
+                <w:u w:color="000000"/>
+                <w14:textOutline w14:w="0" w14:cap="flat" w14:cmpd="sng" w14:algn="ctr">
+                  <w14:noFill/>
+                  <w14:prstDash w14:val="solid"/>
+                  <w14:bevel/>
+                </w14:textOutline>
+              </w:rPr>
+              <w:t>G</w:t>
+            </w:r>
+            <w:r>
+              <w:rPr>
+                <w:rFonts w:ascii="Arial" w:hAnsi="Arial" w:cs="Arial Unicode MS"/>
+                <w:color w:val="000000"/>
+                <w:kern w:val="2"/>
+                <w:sz w:val="28"/>
+                <w:szCs w:val="28"/>
+                <w:u w:color="000000"/>
+                <w14:textOutline w14:w="0" w14:cap="flat" w14:cmpd="sng" w14:algn="ctr">
+                  <w14:noFill/>
+                  <w14:prstDash w14:val="solid"/>
+                  <w14:bevel/>
+                </w14:textOutline>
+              </w:rPr>
+              <w:t>ant chart</w:t>
             </w:r>
           </w:p>
         </w:tc>
@@ -695,23 +725,7 @@
                   <w14:bevel/>
                 </w14:textOutline>
               </w:rPr>
-              <w:t>Project (program)</w:t>
-            </w:r>
-            <w:r>
-              <w:rPr>
-                <w:rFonts w:ascii="Arial" w:hAnsi="Arial" w:cs="Arial Unicode MS"/>
-                <w:color w:val="000000"/>
-                <w:kern w:val="2"/>
-                <w:sz w:val="28"/>
-                <w:szCs w:val="28"/>
-                <w:u w:color="000000"/>
-                <w14:textOutline w14:w="0" w14:cap="flat" w14:cmpd="sng" w14:algn="ctr">
-                  <w14:noFill/>
-                  <w14:prstDash w14:val="solid"/>
-                  <w14:bevel/>
-                </w14:textOutline>
-              </w:rPr>
-              <w:t>, Project WBS</w:t>
+              <w:t>Project (program), Project WBS</w:t>
             </w:r>
           </w:p>
         </w:tc>
@@ -862,17 +876,22 @@
                 <w:sz w:val="28"/>
                 <w:szCs w:val="28"/>
               </w:rPr>
-              <w:t xml:space="preserve">Until now 3 </w:t>
+              <w:t xml:space="preserve">Until now </w:t>
             </w:r>
-            <w:proofErr w:type="gramStart"/>
             <w:r>
               <w:rPr>
                 <w:sz w:val="28"/>
                 <w:szCs w:val="28"/>
               </w:rPr>
-              <w:t>hour</w:t>
+              <w:t>4</w:t>
             </w:r>
-            <w:proofErr w:type="gramEnd"/>
+            <w:r>
+              <w:rPr>
+                <w:sz w:val="28"/>
+                <w:szCs w:val="28"/>
+              </w:rPr>
+              <w:t xml:space="preserve"> hour</w:t>
+            </w:r>
           </w:p>
         </w:tc>
         <w:tc>
@@ -932,19 +951,8 @@
           <w:szCs w:val="28"/>
           <w:u w:color="EE0000"/>
         </w:rPr>
-        <w:t xml:space="preserve">Task </w:t>
+        <w:t>Task Informaion</w:t>
       </w:r>
-      <w:proofErr w:type="spellStart"/>
-      <w:r>
-        <w:rPr>
-          <w:color w:val="EE0000"/>
-          <w:sz w:val="28"/>
-          <w:szCs w:val="28"/>
-          <w:u w:color="EE0000"/>
-        </w:rPr>
-        <w:t>Informaion</w:t>
-      </w:r>
-      <w:proofErr w:type="spellEnd"/>
     </w:p>
     <w:p>
       <w:pPr>

</xml_diff>

<commit_message>
Update Task Info WBS-17
</commit_message>
<xml_diff>
--- a/Documentation/Analysis/Task Informations/In Progress/Abolfazl/Task Info WBS-17 - W.docx
+++ b/Documentation/Analysis/Task Informations/In Progress/Abolfazl/Task Info WBS-17 - W.docx
@@ -884,6 +884,14 @@
                 <w:szCs w:val="28"/>
               </w:rPr>
               <w:t>4</w:t>
+            </w:r>
+            <w:r>
+              <w:rPr>
+                <w:sz w:val="28"/>
+                <w:szCs w:val="28"/>
+                <w:lang w:bidi="fa-IR"/>
+              </w:rPr>
+              <w:t>.5</w:t>
             </w:r>
             <w:r>
               <w:rPr>

</xml_diff>

<commit_message>
Update GantChart; Update NetworkDiagram; Update Calendar; Update Task Info WBS-17
</commit_message>
<xml_diff>
--- a/Documentation/Analysis/Task Informations/In Progress/Abolfazl/Task Info WBS-17 - W.docx
+++ b/Documentation/Analysis/Task Informations/In Progress/Abolfazl/Task Info WBS-17 - W.docx
@@ -883,15 +883,7 @@
                 <w:sz w:val="28"/>
                 <w:szCs w:val="28"/>
               </w:rPr>
-              <w:t>4</w:t>
-            </w:r>
-            <w:r>
-              <w:rPr>
-                <w:sz w:val="28"/>
-                <w:szCs w:val="28"/>
-                <w:lang w:bidi="fa-IR"/>
-              </w:rPr>
-              <w:t>.5</w:t>
+              <w:t>5</w:t>
             </w:r>
             <w:r>
               <w:rPr>

</xml_diff>